<commit_message>
refactor(rtl,tb,docs): rename tick to pulse and apply P_ and PL_ naming conventions to parameters
</commit_message>
<xml_diff>
--- a/docs/SPECIFICATION.docx
+++ b/docs/SPECIFICATION.docx
@@ -466,7 +466,7 @@
         <w:t xml:space="preserve"> </w:t>
       </w:r>
       <w:r>
-        <w:t xml:space="preserve">(Multi-Stage Cascaded Prescaler 1MHz -&gt; 1kHz -&gt; 1Hz Tick Generator)</w:t>
+        <w:t xml:space="preserve">(Multi-Stage Cascaded Prescaler 1MHz -&gt; 1kHz -&gt; 1Hz Pulse Generator)</w:t>
       </w:r>
     </w:p>
     <w:p>
@@ -1119,7 +1119,7 @@
               <w:rPr>
                 <w:rStyle w:val="VerbatimChar"/>
               </w:rPr>
-              <w:t xml:space="preserve">tick_1khz</w:t>
+              <w:t xml:space="preserve">pulse_1khz</w:t>
             </w:r>
             <w:r>
               <w:t xml:space="preserve">,</w:t>
@@ -1131,7 +1131,7 @@
               <w:rPr>
                 <w:rStyle w:val="VerbatimChar"/>
               </w:rPr>
-              <w:t xml:space="preserve">sec_tick</w:t>
+              <w:t xml:space="preserve">sec_pulse</w:t>
             </w:r>
             <w:r>
               <w:t xml:space="preserve">,</w:t>
@@ -1963,7 +1963,7 @@
               <w:rPr>
                 <w:rStyle w:val="VerbatimChar"/>
               </w:rPr>
-              <w:t xml:space="preserve">tick_1khz</w:t>
+              <w:t xml:space="preserve">pulse_1khz</w:t>
             </w:r>
             <w:r>
               <w:t xml:space="preserve">, bộ đếm 5-bit (0 .. 17), cắt giảm 85% năng lượng.</w:t>
@@ -2117,7 +2117,7 @@
               <w:rPr>
                 <w:rStyle w:val="VerbatimChar"/>
               </w:rPr>
-              <w:t xml:space="preserve">sec_tick</w:t>
+              <w:t xml:space="preserve">sec_pulse</w:t>
             </w:r>
             <w:r>
               <w:t xml:space="preserve">.</w:t>
@@ -2464,7 +2464,7 @@
         <w:rPr>
           <w:rStyle w:val="VerbatimChar"/>
         </w:rPr>
-        <w:t xml:space="preserve">tick_1khz</w:t>
+        <w:t xml:space="preserve">pulse_1khz</w:t>
       </w:r>
       <w:r>
         <w:t xml:space="preserve">,</w:t>
@@ -2476,7 +2476,7 @@
         <w:rPr>
           <w:rStyle w:val="VerbatimChar"/>
         </w:rPr>
-        <w:t xml:space="preserve">sec_tick</w:t>
+        <w:t xml:space="preserve">sec_pulse</w:t>
       </w:r>
       <w:r>
         <w:t xml:space="preserve">,</w:t>
@@ -3139,7 +3139,7 @@
                 <w:b/>
                 <w:bCs/>
               </w:rPr>
-              <w:t xml:space="preserve">1 Hz (Kích hoạt theo sec_tick)</w:t>
+              <w:t xml:space="preserve">1 Hz (Kích hoạt theo sec_pulse)</w:t>
             </w:r>
           </w:p>
         </w:tc>
@@ -3688,7 +3688,7 @@
               <w:rPr>
                 <w:rStyle w:val="VerbatimChar"/>
               </w:rPr>
-              <w:t xml:space="preserve">CLK_FREQ_HZ</w:t>
+              <w:t xml:space="preserve">P_CLK_FREQ_HZ</w:t>
             </w:r>
           </w:p>
         </w:tc>
@@ -3804,7 +3804,7 @@
               <w:rPr>
                 <w:rStyle w:val="VerbatimChar"/>
               </w:rPr>
-              <w:t xml:space="preserve">TICK_1KHZ_FREQ_HZ</w:t>
+              <w:t xml:space="preserve">P_PULSE_1KHZ_FREQ_HZ</w:t>
             </w:r>
           </w:p>
         </w:tc>
@@ -3926,7 +3926,7 @@
               <w:rPr>
                 <w:rStyle w:val="VerbatimChar"/>
               </w:rPr>
-              <w:t xml:space="preserve">TICK_1HZ_FREQ_HZ</w:t>
+              <w:t xml:space="preserve">P_PULSE_1HZ_FREQ_HZ</w:t>
             </w:r>
           </w:p>
         </w:tc>
@@ -4042,7 +4042,7 @@
               <w:rPr>
                 <w:rStyle w:val="VerbatimChar"/>
               </w:rPr>
-              <w:t xml:space="preserve">DIV_1KHZ_MAX</w:t>
+              <w:t xml:space="preserve">P_DIV_1KHZ_MAX</w:t>
             </w:r>
           </w:p>
         </w:tc>
@@ -4146,7 +4146,7 @@
               <w:rPr>
                 <w:rStyle w:val="VerbatimChar"/>
               </w:rPr>
-              <w:t xml:space="preserve">DIV_1HZ_MAX</w:t>
+              <w:t xml:space="preserve">P_DIV_1HZ_MAX</w:t>
             </w:r>
           </w:p>
         </w:tc>
@@ -4250,7 +4250,7 @@
               <w:rPr>
                 <w:rStyle w:val="VerbatimChar"/>
               </w:rPr>
-              <w:t xml:space="preserve">DEBOUNCE_TICKS</w:t>
+              <w:t xml:space="preserve">P_DEBOUNCE_PULSES</w:t>
             </w:r>
           </w:p>
         </w:tc>
@@ -4378,7 +4378,7 @@
               <w:rPr>
                 <w:rStyle w:val="VerbatimChar"/>
               </w:rPr>
-              <w:t xml:space="preserve">DEBOUNCE_TOL_PCT</w:t>
+              <w:t xml:space="preserve">P_DEBOUNCE_TOL_PCT</w:t>
             </w:r>
           </w:p>
         </w:tc>
@@ -4506,7 +4506,7 @@
               <w:rPr>
                 <w:rStyle w:val="VerbatimChar"/>
               </w:rPr>
-              <w:t xml:space="preserve">TIMEOUT_SEC</w:t>
+              <w:t xml:space="preserve">P_TIMEOUT_SEC</w:t>
             </w:r>
           </w:p>
         </w:tc>
@@ -4622,7 +4622,7 @@
               <w:rPr>
                 <w:rStyle w:val="VerbatimChar"/>
               </w:rPr>
-              <w:t xml:space="preserve">SEC_WIDTH</w:t>
+              <w:t xml:space="preserve">P_SEC_WIDTH</w:t>
             </w:r>
           </w:p>
         </w:tc>
@@ -4762,7 +4762,7 @@
               <w:rPr>
                 <w:rStyle w:val="VerbatimChar"/>
               </w:rPr>
-              <w:t xml:space="preserve">MIN_WIDTH</w:t>
+              <w:t xml:space="preserve">P_MIN_WIDTH</w:t>
             </w:r>
           </w:p>
         </w:tc>
@@ -4902,7 +4902,7 @@
               <w:rPr>
                 <w:rStyle w:val="VerbatimChar"/>
               </w:rPr>
-              <w:t xml:space="preserve">HOUR_WIDTH</w:t>
+              <w:t xml:space="preserve">P_HOUR_WIDTH</w:t>
             </w:r>
           </w:p>
         </w:tc>
@@ -5040,7 +5040,7 @@
           <w:i/>
           <w:iCs/>
         </w:rPr>
-        <w:t xml:space="preserve">Ghi chú: Các giá trị tham số cấu hình cho phép linh hoạt điều chỉnh quy mô kiểm chứng mô phỏng mà không làm thay đổi bản chất hoạt động của mạch.</w:t>
+        <w:t xml:space="preserve">Ghi chú: Toàn bộ tham số module bắt buộc tuân thủ tiền tố P_ và hằng số nội bộ tuân thủ tiền tố PL_ theo chuẩn rtl_spec_architect.</w:t>
       </w:r>
     </w:p>
     <w:p>
@@ -6386,7 +6386,7 @@
         <w:rPr>
           <w:rStyle w:val="VerbatimChar"/>
         </w:rPr>
-        <w:t xml:space="preserve">tick_1khz</w:t>
+        <w:t xml:space="preserve">pulse_1khz</w:t>
       </w:r>
       <w:r>
         <w:t xml:space="preserve"> </w:t>
@@ -6434,7 +6434,7 @@
         <w:rPr>
           <w:rStyle w:val="VerbatimChar"/>
         </w:rPr>
-        <w:t xml:space="preserve">sec_tick</w:t>
+        <w:t xml:space="preserve">sec_pulse</w:t>
       </w:r>
       <w:r>
         <w:t xml:space="preserve"> </w:t>
@@ -7475,7 +7475,7 @@
               <w:rPr>
                 <w:rStyle w:val="VerbatimChar"/>
               </w:rPr>
-              <w:t xml:space="preserve">tick_1khz</w:t>
+              <w:t xml:space="preserve">pulse_1khz</w:t>
             </w:r>
           </w:p>
         </w:tc>
@@ -7546,7 +7546,7 @@
               <w:rPr>
                 <w:rStyle w:val="VerbatimChar"/>
               </w:rPr>
-              <w:t xml:space="preserve">sec_tick</w:t>
+              <w:t xml:space="preserve">sec_pulse</w:t>
             </w:r>
           </w:p>
         </w:tc>
@@ -8569,7 +8569,7 @@
               <w:rPr>
                 <w:rStyle w:val="VerbatimChar"/>
               </w:rPr>
-              <w:t xml:space="preserve">s_cnt == 59 &amp; sec_tick &amp; ~load_en</w:t>
+              <w:t xml:space="preserve">s_cnt == 59 &amp; sec_pulse &amp; ~load_en</w:t>
             </w:r>
           </w:p>
         </w:tc>
@@ -8771,7 +8771,7 @@
         <w:pStyle w:val="FirstParagraph"/>
       </w:pPr>
       <w:r>
-        <w:t xml:space="preserve">Giản đồ thời gian minh họa bộ lọc nhiễu rung phím 20 ms ±10% (18 ticks @ 1 kHz) và cơ chế tự động phát xung lặp lại (Auto-Repeat) khi giữ phím:</w:t>
+        <w:t xml:space="preserve">Giản đồ thời gian minh họa bộ lọc nhiễu rung phím 20 ms ±10% (18 pulses @ 1 kHz) và cơ chế tự động phát xung lặp lại (Auto-Repeat) khi giữ phím:</w:t>
       </w:r>
     </w:p>
     <w:p>
@@ -9871,7 +9871,7 @@
         <w:rPr>
           <w:rStyle w:val="VerbatimChar"/>
         </w:rPr>
-        <w:t xml:space="preserve">tick_1khz</w:t>
+        <w:t xml:space="preserve">pulse_1khz</w:t>
       </w:r>
       <w:r>
         <w:t xml:space="preserve">) và xung chuẩn thời gian thực 1 Hz (</w:t>
@@ -9880,7 +9880,7 @@
         <w:rPr>
           <w:rStyle w:val="VerbatimChar"/>
         </w:rPr>
-        <w:t xml:space="preserve">sec_tick</w:t>
+        <w:t xml:space="preserve">sec_pulse</w:t>
       </w:r>
       <w:r>
         <w:t xml:space="preserve">). Toàn bộ các ngõ ra là các xung đơn chu kỳ 1 MHz (1 µs) đóng vai trò Clock Enable cho toàn hệ thống.</w:t>
@@ -10336,7 +10336,7 @@
               <w:rPr>
                 <w:rStyle w:val="VerbatimChar"/>
               </w:rPr>
-              <w:t xml:space="preserve">tick_1khz</w:t>
+              <w:t xml:space="preserve">pulse_1khz</w:t>
             </w:r>
           </w:p>
         </w:tc>
@@ -10423,7 +10423,7 @@
               <w:jc w:val="left"/>
             </w:pPr>
             <w:r>
-              <w:t xml:space="preserve">Tầng 1 đạt 999</w:t>
+              <w:t xml:space="preserve">Tầng 1 đạt P_DIV_1KHZ_MAX</w:t>
             </w:r>
           </w:p>
         </w:tc>
@@ -10455,7 +10455,7 @@
               <w:rPr>
                 <w:rStyle w:val="VerbatimChar"/>
               </w:rPr>
-              <w:t xml:space="preserve">sec_tick</w:t>
+              <w:t xml:space="preserve">sec_pulse</w:t>
             </w:r>
           </w:p>
         </w:tc>
@@ -10542,7 +10542,7 @@
               <w:jc w:val="left"/>
             </w:pPr>
             <w:r>
-              <w:t xml:space="preserve">Tầng 2 đạt 999 &amp; tick_1khz</w:t>
+              <w:t xml:space="preserve">Tầng 2 đạt P_DIV_1HZ_MAX &amp; pulse_1khz</w:t>
             </w:r>
           </w:p>
         </w:tc>
@@ -10572,7 +10572,7 @@
           <w:i/>
           <w:iCs/>
         </w:rPr>
-        <w:t xml:space="preserve">Ghi chú: Tín hiệu tick_1khz và sec_tick là các xung active-high có độ rộng đúng 1 chu kỳ clock 1 MHz, hoàn toàn đồng bộ với miền clock gốc.</w:t>
+        <w:t xml:space="preserve">Ghi chú: Tín hiệu pulse_1khz và sec_pulse là các xung active-high có độ rộng đúng 1 chu kỳ clock 1 MHz, hoàn toàn đồng bộ với miền clock gốc.</w:t>
       </w:r>
     </w:p>
     <w:bookmarkEnd w:id="57"/>
@@ -10598,22 +10598,19 @@
           <w:b/>
           <w:bCs/>
         </w:rPr>
-        <w:t xml:space="preserve">Tầng 1 (1 MHz -&gt; 1 kHz):</w:t>
-      </w:r>
-      <w:r>
-        <w:t xml:space="preserve"> </w:t>
-      </w:r>
-      <w:r>
-        <w:t xml:space="preserve">Sử dụng bộ đếm 10-bit (</w:t>
+        <w:t xml:space="preserve">Tham số cấu hình:</w:t>
+      </w:r>
+      <w:r>
+        <w:t xml:space="preserve"> </w:t>
       </w:r>
       <w:r>
         <w:rPr>
           <w:rStyle w:val="VerbatimChar"/>
         </w:rPr>
-        <w:t xml:space="preserve">r_cnt_1khz</w:t>
-      </w:r>
-      <w:r>
-        <w:t xml:space="preserve">) đếm tuần hoàn từ 0 đến 999 theo từng sườn dương của</w:t>
+        <w:t xml:space="preserve">P_CLK_FREQ_HZ = 1_000_000</w:t>
+      </w:r>
+      <w:r>
+        <w:t xml:space="preserve">,</w:t>
       </w:r>
       <w:r>
         <w:t xml:space="preserve"> </w:t>
@@ -10622,13 +10619,10 @@
         <w:rPr>
           <w:rStyle w:val="VerbatimChar"/>
         </w:rPr>
-        <w:t xml:space="preserve">clk</w:t>
-      </w:r>
-      <w:r>
-        <w:t xml:space="preserve"> </w:t>
-      </w:r>
-      <w:r>
-        <w:t xml:space="preserve">(1 MHz). Khi</w:t>
+        <w:t xml:space="preserve">P_PULSE_1KHZ_FREQ_HZ = 1_000</w:t>
+      </w:r>
+      <w:r>
+        <w:t xml:space="preserve">,</w:t>
       </w:r>
       <w:r>
         <w:t xml:space="preserve"> </w:t>
@@ -10637,10 +10631,10 @@
         <w:rPr>
           <w:rStyle w:val="VerbatimChar"/>
         </w:rPr>
-        <w:t xml:space="preserve">r_cnt_1khz == 999</w:t>
-      </w:r>
-      <w:r>
-        <w:t xml:space="preserve">, mạch tạo xung</w:t>
+        <w:t xml:space="preserve">P_PULSE_1HZ_FREQ_HZ = 1</w:t>
+      </w:r>
+      <w:r>
+        <w:t xml:space="preserve">,</w:t>
       </w:r>
       <w:r>
         <w:t xml:space="preserve"> </w:t>
@@ -10649,13 +10643,46 @@
         <w:rPr>
           <w:rStyle w:val="VerbatimChar"/>
         </w:rPr>
-        <w:t xml:space="preserve">tick_1khz = 1</w:t>
-      </w:r>
-      <w:r>
-        <w:t xml:space="preserve"> </w:t>
-      </w:r>
-      <w:r>
-        <w:t xml:space="preserve">trong đúng 1 chu kỳ clock.</w:t>
+        <w:t xml:space="preserve">P_DIV_1KHZ_MAX = 999</w:t>
+      </w:r>
+      <w:r>
+        <w:t xml:space="preserve">,</w:t>
+      </w:r>
+      <w:r>
+        <w:t xml:space="preserve"> </w:t>
+      </w:r>
+      <w:r>
+        <w:rPr>
+          <w:rStyle w:val="VerbatimChar"/>
+        </w:rPr>
+        <w:t xml:space="preserve">P_DIV_1HZ_MAX = 999</w:t>
+      </w:r>
+      <w:r>
+        <w:t xml:space="preserve">,</w:t>
+      </w:r>
+      <w:r>
+        <w:t xml:space="preserve"> </w:t>
+      </w:r>
+      <w:r>
+        <w:rPr>
+          <w:rStyle w:val="VerbatimChar"/>
+        </w:rPr>
+        <w:t xml:space="preserve">P_CNT_1KHZ_WIDTH = 10</w:t>
+      </w:r>
+      <w:r>
+        <w:t xml:space="preserve">,</w:t>
+      </w:r>
+      <w:r>
+        <w:t xml:space="preserve"> </w:t>
+      </w:r>
+      <w:r>
+        <w:rPr>
+          <w:rStyle w:val="VerbatimChar"/>
+        </w:rPr>
+        <w:t xml:space="preserve">P_CNT_1HZ_WIDTH = 10</w:t>
+      </w:r>
+      <w:r>
+        <w:t xml:space="preserve">.</w:t>
       </w:r>
     </w:p>
     <w:p>
@@ -10671,7 +10698,7 @@
           <w:b/>
           <w:bCs/>
         </w:rPr>
-        <w:t xml:space="preserve">Tầng 2 (1 kHz -&gt; 1 Hz):</w:t>
+        <w:t xml:space="preserve">Tầng 1 (1 MHz -&gt; 1 kHz):</w:t>
       </w:r>
       <w:r>
         <w:t xml:space="preserve"> </w:t>
@@ -10683,10 +10710,10 @@
         <w:rPr>
           <w:rStyle w:val="VerbatimChar"/>
         </w:rPr>
-        <w:t xml:space="preserve">r_cnt_1hz</w:t>
-      </w:r>
-      <w:r>
-        <w:t xml:space="preserve">) chạy trên</w:t>
+        <w:t xml:space="preserve">r_cnt_1khz</w:t>
+      </w:r>
+      <w:r>
+        <w:t xml:space="preserve">) đếm tuần hoàn từ 0 đến</w:t>
       </w:r>
       <w:r>
         <w:t xml:space="preserve"> </w:t>
@@ -10695,13 +10722,28 @@
         <w:rPr>
           <w:rStyle w:val="VerbatimChar"/>
         </w:rPr>
+        <w:t xml:space="preserve">P_DIV_1KHZ_MAX</w:t>
+      </w:r>
+      <w:r>
+        <w:t xml:space="preserve"> </w:t>
+      </w:r>
+      <w:r>
+        <w:t xml:space="preserve">(999) theo từng sườn dương của</w:t>
+      </w:r>
+      <w:r>
+        <w:t xml:space="preserve"> </w:t>
+      </w:r>
+      <w:r>
+        <w:rPr>
+          <w:rStyle w:val="VerbatimChar"/>
+        </w:rPr>
         <w:t xml:space="preserve">clk</w:t>
       </w:r>
       <w:r>
         <w:t xml:space="preserve"> </w:t>
       </w:r>
       <w:r>
-        <w:t xml:space="preserve">nhưng chỉ tăng giá trị khi có</w:t>
+        <w:t xml:space="preserve">(1 MHz). Khi</w:t>
       </w:r>
       <w:r>
         <w:t xml:space="preserve"> </w:t>
@@ -10710,10 +10752,10 @@
         <w:rPr>
           <w:rStyle w:val="VerbatimChar"/>
         </w:rPr>
-        <w:t xml:space="preserve">tick_1khz == 1</w:t>
-      </w:r>
-      <w:r>
-        <w:t xml:space="preserve">. Khi</w:t>
+        <w:t xml:space="preserve">r_cnt_1khz == 999</w:t>
+      </w:r>
+      <w:r>
+        <w:t xml:space="preserve">, mạch tạo xung</w:t>
       </w:r>
       <w:r>
         <w:t xml:space="preserve"> </w:t>
@@ -10722,40 +10764,13 @@
         <w:rPr>
           <w:rStyle w:val="VerbatimChar"/>
         </w:rPr>
-        <w:t xml:space="preserve">r_cnt_1hz == 999</w:t>
-      </w:r>
-      <w:r>
-        <w:t xml:space="preserve"> </w:t>
-      </w:r>
-      <w:r>
-        <w:t xml:space="preserve">đồng thời có</w:t>
-      </w:r>
-      <w:r>
-        <w:t xml:space="preserve"> </w:t>
-      </w:r>
-      <w:r>
-        <w:rPr>
-          <w:rStyle w:val="VerbatimChar"/>
-        </w:rPr>
-        <w:t xml:space="preserve">tick_1khz == 1</w:t>
-      </w:r>
-      <w:r>
-        <w:t xml:space="preserve">, mạch phát xung chuẩn thời gian thực</w:t>
-      </w:r>
-      <w:r>
-        <w:t xml:space="preserve"> </w:t>
-      </w:r>
-      <w:r>
-        <w:rPr>
-          <w:rStyle w:val="VerbatimChar"/>
-        </w:rPr>
-        <w:t xml:space="preserve">sec_tick = 1</w:t>
-      </w:r>
-      <w:r>
-        <w:t xml:space="preserve"> </w:t>
-      </w:r>
-      <w:r>
-        <w:t xml:space="preserve">độ rộng đúng 1 chu kỳ clock 1 MHz.</w:t>
+        <w:t xml:space="preserve">pulse_1khz = 1</w:t>
+      </w:r>
+      <w:r>
+        <w:t xml:space="preserve"> </w:t>
+      </w:r>
+      <w:r>
+        <w:t xml:space="preserve">trong đúng 1 chu kỳ clock.</w:t>
       </w:r>
     </w:p>
     <w:p>
@@ -10771,6 +10786,106 @@
           <w:b/>
           <w:bCs/>
         </w:rPr>
+        <w:t xml:space="preserve">Tầng 2 (1 kHz -&gt; 1 Hz):</w:t>
+      </w:r>
+      <w:r>
+        <w:t xml:space="preserve"> </w:t>
+      </w:r>
+      <w:r>
+        <w:t xml:space="preserve">Sử dụng bộ đếm 10-bit (</w:t>
+      </w:r>
+      <w:r>
+        <w:rPr>
+          <w:rStyle w:val="VerbatimChar"/>
+        </w:rPr>
+        <w:t xml:space="preserve">r_cnt_1hz</w:t>
+      </w:r>
+      <w:r>
+        <w:t xml:space="preserve">) chạy trên</w:t>
+      </w:r>
+      <w:r>
+        <w:t xml:space="preserve"> </w:t>
+      </w:r>
+      <w:r>
+        <w:rPr>
+          <w:rStyle w:val="VerbatimChar"/>
+        </w:rPr>
+        <w:t xml:space="preserve">clk</w:t>
+      </w:r>
+      <w:r>
+        <w:t xml:space="preserve"> </w:t>
+      </w:r>
+      <w:r>
+        <w:t xml:space="preserve">nhưng chỉ tăng giá trị khi có</w:t>
+      </w:r>
+      <w:r>
+        <w:t xml:space="preserve"> </w:t>
+      </w:r>
+      <w:r>
+        <w:rPr>
+          <w:rStyle w:val="VerbatimChar"/>
+        </w:rPr>
+        <w:t xml:space="preserve">pulse_1khz == 1</w:t>
+      </w:r>
+      <w:r>
+        <w:t xml:space="preserve">. Khi</w:t>
+      </w:r>
+      <w:r>
+        <w:t xml:space="preserve"> </w:t>
+      </w:r>
+      <w:r>
+        <w:rPr>
+          <w:rStyle w:val="VerbatimChar"/>
+        </w:rPr>
+        <w:t xml:space="preserve">r_cnt_1hz == 999</w:t>
+      </w:r>
+      <w:r>
+        <w:t xml:space="preserve"> </w:t>
+      </w:r>
+      <w:r>
+        <w:t xml:space="preserve">đồng thời có</w:t>
+      </w:r>
+      <w:r>
+        <w:t xml:space="preserve"> </w:t>
+      </w:r>
+      <w:r>
+        <w:rPr>
+          <w:rStyle w:val="VerbatimChar"/>
+        </w:rPr>
+        <w:t xml:space="preserve">pulse_1khz == 1</w:t>
+      </w:r>
+      <w:r>
+        <w:t xml:space="preserve">, mạch phát xung chuẩn thời gian thực</w:t>
+      </w:r>
+      <w:r>
+        <w:t xml:space="preserve"> </w:t>
+      </w:r>
+      <w:r>
+        <w:rPr>
+          <w:rStyle w:val="VerbatimChar"/>
+        </w:rPr>
+        <w:t xml:space="preserve">sec_pulse = 1</w:t>
+      </w:r>
+      <w:r>
+        <w:t xml:space="preserve"> </w:t>
+      </w:r>
+      <w:r>
+        <w:t xml:space="preserve">độ rộng đúng 1 chu kỳ clock 1 MHz.</w:t>
+      </w:r>
+    </w:p>
+    <w:p>
+      <w:pPr>
+        <w:pStyle w:val="Compact"/>
+        <w:numPr>
+          <w:ilvl w:val="0"/>
+          <w:numId w:val="1021"/>
+        </w:numPr>
+      </w:pPr>
+      <w:r>
+        <w:rPr>
+          <w:b/>
+          <w:bCs/>
+        </w:rPr>
         <w:t xml:space="preserve">Tối ưu PPA:</w:t>
       </w:r>
       <w:r>
@@ -10804,7 +10919,7 @@
         <w:rPr>
           <w:rStyle w:val="VerbatimChar"/>
         </w:rPr>
-        <w:t xml:space="preserve">tick_1khz</w:t>
+        <w:t xml:space="preserve">pulse_1khz</w:t>
       </w:r>
       <w:r>
         <w:t xml:space="preserve"> </w:t>
@@ -10819,7 +10934,7 @@
         <w:rPr>
           <w:rStyle w:val="VerbatimChar"/>
         </w:rPr>
-        <w:t xml:space="preserve">sec_tick</w:t>
+        <w:t xml:space="preserve">sec_pulse</w:t>
       </w:r>
       <w:r>
         <w:t xml:space="preserve">:</w:t>
@@ -10834,7 +10949,7 @@
           <wp:inline>
             <wp:extent cx="5334000" cy="1338942"/>
             <wp:effectExtent b="0" l="0" r="0" t="0"/>
-            <wp:docPr descr="Hình 3.2.4: Giản đồ xung phân tần 1MHz ra 1kHz sample_tick và 1Hz sec_tick (WaveDrom)" title="" id="60" name="Picture"/>
+            <wp:docPr descr="Hình 3.2.4: Giản đồ xung phân tần 1MHz ra 1kHz pulse_1khz và 1Hz sec_pulse (WaveDrom)" title="" id="60" name="Picture"/>
             <a:graphic>
               <a:graphicData uri="http://schemas.openxmlformats.org/drawingml/2006/picture">
                 <pic:pic>
@@ -10877,7 +10992,7 @@
         <w:pStyle w:val="ImageCaption"/>
       </w:pPr>
       <w:r>
-        <w:t xml:space="preserve">Hình 3.2.4: Giản đồ xung phân tần 1MHz ra 1kHz sample_tick và 1Hz sec_tick (WaveDrom)</w:t>
+        <w:t xml:space="preserve">Hình 3.2.4: Giản đồ xung phân tần 1MHz ra 1kHz pulse_1khz và 1Hz sec_pulse (WaveDrom)</w:t>
       </w:r>
     </w:p>
     <w:p>
@@ -10943,7 +11058,7 @@
         <w:rPr>
           <w:rStyle w:val="VerbatimChar"/>
         </w:rPr>
-        <w:t xml:space="preserve">tick_1khz</w:t>
+        <w:t xml:space="preserve">pulse_1khz</w:t>
       </w:r>
       <w:r>
         <w:t xml:space="preserve">), áp dụng dải dung sai thời gian danh định 20 ms ±10% (18 ms .. 22 ms) và tự động phát xung tuần hoàn khi giữ phím (Auto-Repeat).</w:t>
@@ -11465,7 +11580,7 @@
               <w:rPr>
                 <w:rStyle w:val="VerbatimChar"/>
               </w:rPr>
-              <w:t xml:space="preserve">tick_1khz</w:t>
+              <w:t xml:space="preserve">pulse_1khz</w:t>
             </w:r>
             <w:r>
               <w:t xml:space="preserve">) từ prescaler</w:t>
@@ -11759,13 +11874,13 @@
           <w:b/>
           <w:bCs/>
         </w:rPr>
-        <w:t xml:space="preserve">Đồng bộ hóa 2 tầng:</w:t>
-      </w:r>
-      <w:r>
-        <w:t xml:space="preserve"> </w:t>
-      </w:r>
-      <w:r>
-        <w:t xml:space="preserve">Tín hiệu nút bấm bất đồng bộ</w:t>
+        <w:t xml:space="preserve">Tham số &amp; Hằng số:</w:t>
+      </w:r>
+      <w:r>
+        <w:t xml:space="preserve"> </w:t>
+      </w:r>
+      <w:r>
+        <w:t xml:space="preserve">Tham số cấu hình</w:t>
       </w:r>
       <w:r>
         <w:t xml:space="preserve"> </w:t>
@@ -11774,13 +11889,10 @@
         <w:rPr>
           <w:rStyle w:val="VerbatimChar"/>
         </w:rPr>
-        <w:t xml:space="preserve">btn_in</w:t>
-      </w:r>
-      <w:r>
-        <w:t xml:space="preserve"> </w:t>
-      </w:r>
-      <w:r>
-        <w:t xml:space="preserve">đi qua 2 tầng Flip-Flop được lấy mẫu ở mỗi xung</w:t>
+        <w:t xml:space="preserve">P_DEBOUNCE_PULSES = 20</w:t>
+      </w:r>
+      <w:r>
+        <w:t xml:space="preserve">,</w:t>
       </w:r>
       <w:r>
         <w:t xml:space="preserve"> </w:t>
@@ -11789,13 +11901,46 @@
         <w:rPr>
           <w:rStyle w:val="VerbatimChar"/>
         </w:rPr>
-        <w:t xml:space="preserve">clk_en</w:t>
-      </w:r>
-      <w:r>
-        <w:t xml:space="preserve"> </w:t>
-      </w:r>
-      <w:r>
-        <w:t xml:space="preserve">để chống hiện tượng bất ổn định (Metastability).</w:t>
+        <w:t xml:space="preserve">P_DEBOUNCE_TOL_PCT = 10</w:t>
+      </w:r>
+      <w:r>
+        <w:t xml:space="preserve">. Hằng số cục bộ</w:t>
+      </w:r>
+      <w:r>
+        <w:t xml:space="preserve"> </w:t>
+      </w:r>
+      <w:r>
+        <w:rPr>
+          <w:rStyle w:val="VerbatimChar"/>
+        </w:rPr>
+        <w:t xml:space="preserve">PL_DEBOUNCE_MIN_PULSES = 18</w:t>
+      </w:r>
+      <w:r>
+        <w:t xml:space="preserve">,</w:t>
+      </w:r>
+      <w:r>
+        <w:t xml:space="preserve"> </w:t>
+      </w:r>
+      <w:r>
+        <w:rPr>
+          <w:rStyle w:val="VerbatimChar"/>
+        </w:rPr>
+        <w:t xml:space="preserve">PL_EFFECTIVE_PULSES = 18</w:t>
+      </w:r>
+      <w:r>
+        <w:t xml:space="preserve">,</w:t>
+      </w:r>
+      <w:r>
+        <w:t xml:space="preserve"> </w:t>
+      </w:r>
+      <w:r>
+        <w:rPr>
+          <w:rStyle w:val="VerbatimChar"/>
+        </w:rPr>
+        <w:t xml:space="preserve">PL_CNT_WIDTH = 5</w:t>
+      </w:r>
+      <w:r>
+        <w:t xml:space="preserve">.</w:t>
       </w:r>
     </w:p>
     <w:p>
@@ -11811,13 +11956,13 @@
           <w:b/>
           <w:bCs/>
         </w:rPr>
-        <w:t xml:space="preserve">Ngưỡng dung sai ±10%:</w:t>
-      </w:r>
-      <w:r>
-        <w:t xml:space="preserve"> </w:t>
-      </w:r>
-      <w:r>
-        <w:t xml:space="preserve">Với chu kỳ 20 ms tại tần số lấy mẫu 1 kHz, số tick danh định là 20 ticks. Dải dung sai ±10% cho phép nhận diện phím hợp lệ từ 18 ticks:</w:t>
+        <w:t xml:space="preserve">Đồng bộ hóa 2 tầng:</w:t>
+      </w:r>
+      <w:r>
+        <w:t xml:space="preserve"> </w:t>
+      </w:r>
+      <w:r>
+        <w:t xml:space="preserve">Tín hiệu nút bấm bất đồng bộ</w:t>
       </w:r>
       <w:r>
         <w:t xml:space="preserve"> </w:t>
@@ -11826,7 +11971,28 @@
         <w:rPr>
           <w:rStyle w:val="VerbatimChar"/>
         </w:rPr>
-        <w:t xml:space="preserve">EFFECTIVE_TICKS = 20 - floor(20 * 0.10) = 18 ticks (18 ms)</w:t>
+        <w:t xml:space="preserve">btn_in</w:t>
+      </w:r>
+      <w:r>
+        <w:t xml:space="preserve"> </w:t>
+      </w:r>
+      <w:r>
+        <w:t xml:space="preserve">đi qua 2 tầng Flip-Flop được lấy mẫu ở mỗi xung</w:t>
+      </w:r>
+      <w:r>
+        <w:t xml:space="preserve"> </w:t>
+      </w:r>
+      <w:r>
+        <w:rPr>
+          <w:rStyle w:val="VerbatimChar"/>
+        </w:rPr>
+        <w:t xml:space="preserve">clk_en</w:t>
+      </w:r>
+      <w:r>
+        <w:t xml:space="preserve"> </w:t>
+      </w:r>
+      <w:r>
+        <w:t xml:space="preserve">để chống hiện tượng bất ổn định (Metastability).</w:t>
       </w:r>
     </w:p>
     <w:p>
@@ -11842,13 +12008,22 @@
           <w:b/>
           <w:bCs/>
         </w:rPr>
-        <w:t xml:space="preserve">Loại bỏ nhiễu rung (&lt; 18 ms):</w:t>
-      </w:r>
-      <w:r>
-        <w:t xml:space="preserve"> </w:t>
-      </w:r>
-      <w:r>
-        <w:t xml:space="preserve">Nếu phím bị nhả trước khi bộ đếm 5-bit đạt 17 (đếm từ 0 .. 17 là 18 ticks), bộ đếm lập tức bị xóa về 0, không phát xung.</w:t>
+        <w:t xml:space="preserve">Ngưỡng dung sai ±10%:</w:t>
+      </w:r>
+      <w:r>
+        <w:t xml:space="preserve"> </w:t>
+      </w:r>
+      <w:r>
+        <w:t xml:space="preserve">Với chu kỳ 20 ms tại tần số lấy mẫu 1 kHz, số chu kỳ danh định là 20 pulses. Dải dung sai ±10% cho phép nhận diện phím hợp lệ từ 18 pulses:</w:t>
+      </w:r>
+      <w:r>
+        <w:t xml:space="preserve"> </w:t>
+      </w:r>
+      <w:r>
+        <w:rPr>
+          <w:rStyle w:val="VerbatimChar"/>
+        </w:rPr>
+        <w:t xml:space="preserve">PL_EFFECTIVE_PULSES = P_DEBOUNCE_PULSES - floor(P_DEBOUNCE_PULSES * P_DEBOUNCE_TOL_PCT / 100) = 18 pulses (18 ms)</w:t>
       </w:r>
     </w:p>
     <w:p>
@@ -11864,6 +12039,28 @@
           <w:b/>
           <w:bCs/>
         </w:rPr>
+        <w:t xml:space="preserve">Loại bỏ nhiễu rung (&lt; 18 ms):</w:t>
+      </w:r>
+      <w:r>
+        <w:t xml:space="preserve"> </w:t>
+      </w:r>
+      <w:r>
+        <w:t xml:space="preserve">Nếu phím bị nhả trước khi bộ đếm 5-bit đạt 17 (đếm từ 0 .. 17 là 18 pulses), bộ đếm lập tức bị xóa về 0, không phát xung.</w:t>
+      </w:r>
+    </w:p>
+    <w:p>
+      <w:pPr>
+        <w:pStyle w:val="Compact"/>
+        <w:numPr>
+          <w:ilvl w:val="0"/>
+          <w:numId w:val="1022"/>
+        </w:numPr>
+      </w:pPr>
+      <w:r>
+        <w:rPr>
+          <w:b/>
+          <w:bCs/>
+        </w:rPr>
         <w:t xml:space="preserve">Auto-Repeat (&gt;= 18 ms):</w:t>
       </w:r>
       <w:r>
@@ -11885,7 +12082,7 @@
         <w:t xml:space="preserve"> </w:t>
       </w:r>
       <w:r>
-        <w:t xml:space="preserve">độ rộng đúng 1 chu kỳ clock 1 MHz. Nếu người dùng tiếp tục giữ phím, bộ đếm tự động reset về 0 và tiếp tục đếm lại 18 ticks để phát xung lặp lại tuần hoàn đều đặn.</w:t>
+        <w:t xml:space="preserve">độ rộng đúng 1 chu kỳ clock 1 MHz. Nếu người dùng tiếp tục giữ phím, bộ đếm tự động reset về 0 và tiếp tục đếm lại 18 pulses để phát xung lặp lại tuần hoàn đều đặn.</w:t>
       </w:r>
     </w:p>
     <w:bookmarkEnd w:id="69"/>
@@ -12060,7 +12257,7 @@
         <w:rPr>
           <w:rStyle w:val="VerbatimChar"/>
         </w:rPr>
-        <w:t xml:space="preserve">tick_1khz</w:t>
+        <w:t xml:space="preserve">pulse_1khz</w:t>
       </w:r>
       <w:r>
         <w:t xml:space="preserve"> </w:t>
@@ -12519,7 +12716,7 @@
               <w:rPr>
                 <w:rStyle w:val="VerbatimChar"/>
               </w:rPr>
-              <w:t xml:space="preserve">tick_1khz</w:t>
+              <w:t xml:space="preserve">pulse_1khz</w:t>
             </w:r>
           </w:p>
         </w:tc>
@@ -13301,6 +13498,46 @@
       </w:pPr>
       <w:r>
         <w:t xml:space="preserve">3.4.3 Nguyên lý hoạt động (Operating Principle)</w:t>
+      </w:r>
+    </w:p>
+    <w:p>
+      <w:pPr>
+        <w:pStyle w:val="Compact"/>
+        <w:numPr>
+          <w:ilvl w:val="0"/>
+          <w:numId w:val="1023"/>
+        </w:numPr>
+      </w:pPr>
+      <w:r>
+        <w:rPr>
+          <w:b/>
+          <w:bCs/>
+        </w:rPr>
+        <w:t xml:space="preserve">Tham số cấu hình:</w:t>
+      </w:r>
+      <w:r>
+        <w:t xml:space="preserve"> </w:t>
+      </w:r>
+      <w:r>
+        <w:rPr>
+          <w:rStyle w:val="VerbatimChar"/>
+        </w:rPr>
+        <w:t xml:space="preserve">P_DEBOUNCE_PULSES = 20</w:t>
+      </w:r>
+      <w:r>
+        <w:t xml:space="preserve">,</w:t>
+      </w:r>
+      <w:r>
+        <w:t xml:space="preserve"> </w:t>
+      </w:r>
+      <w:r>
+        <w:rPr>
+          <w:rStyle w:val="VerbatimChar"/>
+        </w:rPr>
+        <w:t xml:space="preserve">P_DEBOUNCE_TOL_PCT = 10</w:t>
+      </w:r>
+      <w:r>
+        <w:t xml:space="preserve">.</w:t>
       </w:r>
     </w:p>
     <w:p>
@@ -14345,7 +14582,7 @@
               <w:rPr>
                 <w:rStyle w:val="VerbatimChar"/>
               </w:rPr>
-              <w:t xml:space="preserve">sec_tick</w:t>
+              <w:t xml:space="preserve">sec_pulse</w:t>
             </w:r>
           </w:p>
         </w:tc>
@@ -15879,7 +16116,7 @@
               <w:rPr>
                 <w:rStyle w:val="VerbatimChar"/>
               </w:rPr>
-              <w:t xml:space="preserve">sec_tick == 1</w:t>
+              <w:t xml:space="preserve">sec_pulse == 1</w:t>
             </w:r>
             <w:r>
               <w:t xml:space="preserve"> </w:t>
@@ -16003,7 +16240,7 @@
               <w:rPr>
                 <w:rStyle w:val="VerbatimChar"/>
               </w:rPr>
-              <w:t xml:space="preserve">sec_tick == 1</w:t>
+              <w:t xml:space="preserve">sec_pulse == 1</w:t>
             </w:r>
             <w:r>
               <w:t xml:space="preserve"> </w:t>
@@ -16294,7 +16531,7 @@
               <w:rPr>
                 <w:rStyle w:val="VerbatimChar"/>
               </w:rPr>
-              <w:t xml:space="preserve">sec_tick == 1</w:t>
+              <w:t xml:space="preserve">sec_pulse == 1</w:t>
             </w:r>
             <w:r>
               <w:t xml:space="preserve"> </w:t>
@@ -16418,7 +16655,7 @@
               <w:rPr>
                 <w:rStyle w:val="VerbatimChar"/>
               </w:rPr>
-              <w:t xml:space="preserve">sec_tick == 1</w:t>
+              <w:t xml:space="preserve">sec_pulse == 1</w:t>
             </w:r>
             <w:r>
               <w:t xml:space="preserve"> </w:t>
@@ -16737,7 +16974,7 @@
               <w:rPr>
                 <w:rStyle w:val="VerbatimChar"/>
               </w:rPr>
-              <w:t xml:space="preserve">sec_tick == 1</w:t>
+              <w:t xml:space="preserve">sec_pulse == 1</w:t>
             </w:r>
             <w:r>
               <w:t xml:space="preserve"> </w:t>
@@ -16861,7 +17098,7 @@
               <w:rPr>
                 <w:rStyle w:val="VerbatimChar"/>
               </w:rPr>
-              <w:t xml:space="preserve">sec_tick == 1</w:t>
+              <w:t xml:space="preserve">sec_pulse == 1</w:t>
             </w:r>
             <w:r>
               <w:t xml:space="preserve"> </w:t>
@@ -16930,7 +17167,7 @@
           <w:i/>
           <w:iCs/>
         </w:rPr>
-        <w:t xml:space="preserve">Ghi chú: Bộ đếm timeout 5s tự động xóa về 0 mỗi khi người dùng có thao tác bấm phím UP hoặc DOWN (Keep-alive).</w:t>
+        <w:t xml:space="preserve">Ghi chú: Bộ đếm timeout 5s tự động xóa về 0 mỗi khi người dùng có thao tác bấm phím UP hoặc DOWN (Keep-alive). Tham số cấu hình: P_TIMEOUT_SEC = 5, P_SEC_WIDTH = 6, P_MIN_WIDTH = 6, P_HOUR_WIDTH = 5; Hằng số cục bộ PL_TIMEOUT_CNT_WIDTH = 3.</w:t>
       </w:r>
     </w:p>
     <w:bookmarkEnd w:id="90"/>
@@ -17069,7 +17306,7 @@
         <w:rPr>
           <w:rStyle w:val="VerbatimChar"/>
         </w:rPr>
-        <w:t xml:space="preserve">sec_tick</w:t>
+        <w:t xml:space="preserve">sec_pulse</w:t>
       </w:r>
       <w:r>
         <w:t xml:space="preserve"> </w:t>
@@ -17540,7 +17777,7 @@
               <w:rPr>
                 <w:rStyle w:val="VerbatimChar"/>
               </w:rPr>
-              <w:t xml:space="preserve">sec_tick</w:t>
+              <w:t xml:space="preserve">sec_pulse</w:t>
             </w:r>
           </w:p>
         </w:tc>
@@ -18064,7 +18301,7 @@
               <w:rPr>
                 <w:rStyle w:val="VerbatimChar"/>
               </w:rPr>
-              <w:t xml:space="preserve">s_out == 59 &amp; sec_tick &amp; ~load_en</w:t>
+              <w:t xml:space="preserve">s_out == 59 &amp; sec_pulse &amp; ~load_en</w:t>
             </w:r>
             <w:r>
               <w:t xml:space="preserve">)</w:t>
@@ -18118,7 +18355,7 @@
           <w:i/>
           <w:iCs/>
         </w:rPr>
-        <w:t xml:space="preserve">Ghi chú: Cờ sec_rollover bị khóa (gated = 0) khi load_en = 1 để tránh kích hoạt nhảy phút ngoài ý muốn khi nạp thời gian.</w:t>
+        <w:t xml:space="preserve">Ghi chú: Cờ sec_rollover bị khóa (gated = 0) khi load_en = 1 để tránh kích hoạt nhảy phút ngoài ý muốn khi nạp thời gian. Tham số cấu hình: P_SEC_WIDTH = 6.</w:t>
       </w:r>
     </w:p>
     <w:bookmarkEnd w:id="100"/>
@@ -18217,7 +18454,7 @@
         <w:rPr>
           <w:rStyle w:val="VerbatimChar"/>
         </w:rPr>
-        <w:t xml:space="preserve">sec_tick == 1</w:t>
+        <w:t xml:space="preserve">sec_pulse == 1</w:t>
       </w:r>
       <w:r>
         <w:t xml:space="preserve">, bộ đếm tăng Modulo-60 (0 .. 59 -&gt; 0) liên tục 24/7 chuẩn thời gian thực.</w:t>
@@ -18245,7 +18482,7 @@
         <w:rPr>
           <w:rStyle w:val="VerbatimChar"/>
         </w:rPr>
-        <w:t xml:space="preserve">sec_rollover = (r_sec == 6'd59) &amp; sec_tick &amp; ~load_en;</w:t>
+        <w:t xml:space="preserve">sec_rollover = (r_sec == 6'd59) &amp; sec_pulse &amp; ~load_en;</w:t>
       </w:r>
       <w:r>
         <w:t xml:space="preserve">.</w:t>
@@ -19448,7 +19685,7 @@
           <w:i/>
           <w:iCs/>
         </w:rPr>
-        <w:t xml:space="preserve">Ghi chú: Bộ đếm phút tăng 1 đơn vị mỗi khi nhận xung sec_rollover từ second_counter và nạp đè song song khi có load_en = 1.</w:t>
+        <w:t xml:space="preserve">Ghi chú: Bộ đếm phút tăng 1 đơn vị mỗi khi nhận xung sec_rollover từ second_counter và nạp đè song song khi có load_en = 1. Tham số cấu hình: P_MIN_WIDTH = 6.</w:t>
       </w:r>
     </w:p>
     <w:bookmarkEnd w:id="111"/>
@@ -20668,7 +20905,7 @@
           <w:i/>
           <w:iCs/>
         </w:rPr>
-        <w:t xml:space="preserve">Ghi chú: Bộ đếm giờ tăng 1 đơn vị mỗi khi nhận xung min_rollover từ minute_counter và nạp đè song song khi có load_en = 1.</w:t>
+        <w:t xml:space="preserve">Ghi chú: Bộ đếm giờ tăng 1 đơn vị mỗi khi nhận xung min_rollover từ minute_counter và nạp đè song song khi có load_en = 1. Tham số cấu hình: P_HOUR_WIDTH = 5.</w:t>
       </w:r>
     </w:p>
     <w:bookmarkEnd w:id="122"/>
@@ -20921,7 +21158,7 @@
         <w:rPr>
           <w:rStyle w:val="VerbatimChar"/>
         </w:rPr>
-        <w:t xml:space="preserve">MODE_RUN</w:t>
+        <w:t xml:space="preserve">PL_MODE_RUN = 2'b00</w:t>
       </w:r>
       <w:r>
         <w:t xml:space="preserve">) và giá trị trong bộ đệm chỉnh sửa (khi ở các chế độ</w:t>
@@ -22309,7 +22546,7 @@
           <w:i/>
           <w:iCs/>
         </w:rPr>
-        <w:t xml:space="preserve">Ghi chú: Mạch hoạt động hoàn toàn bằng logic tổ hợp zero-latency, không sử dụng Flip-Flop.</w:t>
+        <w:t xml:space="preserve">Ghi chú: Mạch hoạt động hoàn toàn bằng logic tổ hợp zero-latency, không sử dụng Flip-Flop. Tham số cấu hình: P_SEC_WIDTH = 6, P_MIN_WIDTH = 6, P_HOUR_WIDTH = 5; Tham số cục bộ: PL_MODE_RUN = 2’b00.</w:t>
       </w:r>
     </w:p>
     <w:bookmarkEnd w:id="133"/>
@@ -22361,7 +22598,7 @@
         <w:rPr>
           <w:rStyle w:val="VerbatimChar"/>
         </w:rPr>
-        <w:t xml:space="preserve">s_out = (adj_mode == 2'b00) ? s_cnt : s_adj;</w:t>
+        <w:t xml:space="preserve">s_out = (adj_mode == PL_MODE_RUN) ? s_cnt : s_adj;</w:t>
       </w:r>
     </w:p>
     <w:p>
@@ -22376,7 +22613,7 @@
         <w:rPr>
           <w:rStyle w:val="VerbatimChar"/>
         </w:rPr>
-        <w:t xml:space="preserve">m_out = (adj_mode == 2'b00) ? m_cnt : m_adj;</w:t>
+        <w:t xml:space="preserve">m_out = (adj_mode == PL_MODE_RUN) ? m_cnt : m_adj;</w:t>
       </w:r>
     </w:p>
     <w:p>
@@ -22391,7 +22628,7 @@
         <w:rPr>
           <w:rStyle w:val="VerbatimChar"/>
         </w:rPr>
-        <w:t xml:space="preserve">h_out = (adj_mode == 2'b00) ? h_cnt : h_adj;</w:t>
+        <w:t xml:space="preserve">h_out = (adj_mode == PL_MODE_RUN) ? h_cnt : h_adj;</w:t>
       </w:r>
     </w:p>
     <w:bookmarkEnd w:id="134"/>
@@ -24651,7 +24888,7 @@
           <w:b/>
           <w:bCs/>
         </w:rPr>
-        <w:t xml:space="preserve">TC2: Kiểm chứng Xung Phân Tầng Prescaler (tick_1khz, sec_tick):</w:t>
+        <w:t xml:space="preserve">TC2: Kiểm chứng Xung Phân Tầng Prescaler (pulse_1khz, sec_pulse):</w:t>
       </w:r>
       <w:r>
         <w:t xml:space="preserve"> </w:t>
@@ -24666,7 +24903,7 @@
         <w:rPr>
           <w:rStyle w:val="VerbatimChar"/>
         </w:rPr>
-        <w:t xml:space="preserve">tick_1khz</w:t>
+        <w:t xml:space="preserve">pulse_1khz</w:t>
       </w:r>
       <w:r>
         <w:t xml:space="preserve"> </w:t>
@@ -24681,7 +24918,7 @@
         <w:rPr>
           <w:rStyle w:val="VerbatimChar"/>
         </w:rPr>
-        <w:t xml:space="preserve">sec_tick</w:t>
+        <w:t xml:space="preserve">sec_pulse</w:t>
       </w:r>
       <w:r>
         <w:t xml:space="preserve"> </w:t>
@@ -24979,7 +25216,7 @@
         <w:t xml:space="preserve"> </w:t>
       </w:r>
       <w:r>
-        <w:t xml:space="preserve">Nhấn &lt; 18ms (17 ticks) bị hủy hoàn toàn, giữ &gt;= 18ms phát đúng 1 xung, giữ lâu phát Auto-Repeat đều đặn.</w:t>
+        <w:t xml:space="preserve">Nhấn &lt; 18ms (17 pulses) bị hủy hoàn toàn, giữ &gt;= 18ms phát đúng 1 xung, giữ lâu phát Auto-Repeat đều đặn.</w:t>
       </w:r>
     </w:p>
     <w:p>

</xml_diff>

<commit_message>
feat(rtl,spec): convert to asynchronous reset and standardize reset_sync as async assert sync deassert
</commit_message>
<xml_diff>
--- a/docs/SPECIFICATION.docx
+++ b/docs/SPECIFICATION.docx
@@ -2232,7 +2232,7 @@
               <w:jc w:val="left"/>
             </w:pPr>
             <w:r>
-              <w:t xml:space="preserve">Triển khai khối Reset Synchronizer 2-FF đồng bộ hóa hoàn toàn trên miền clock 1 MHz.</w:t>
+              <w:t xml:space="preserve">Triển khai khối Reset Synchronizer 2-FF xác lập bất đồng bộ, giải trừ đồng bộ trên miền clock 1 MHz.</w:t>
             </w:r>
           </w:p>
         </w:tc>
@@ -5465,19 +5465,19 @@
               <w:jc w:val="center"/>
             </w:pPr>
             <w:r>
-              <w:t xml:space="preserve">Async/Sync</w:t>
-            </w:r>
-          </w:p>
-        </w:tc>
-        <w:tc>
-          <w:tcPr/>
-          <w:p>
-            <w:pPr>
-              <w:pStyle w:val="Compact"/>
-              <w:jc w:val="left"/>
-            </w:pPr>
-            <w:r>
-              <w:t xml:space="preserve">Reset toàn cục, tích cực mức thấp (qua bộ reset synchronizer)</w:t>
+              <w:t xml:space="preserve">Async (Active-Low)</w:t>
+            </w:r>
+          </w:p>
+        </w:tc>
+        <w:tc>
+          <w:tcPr/>
+          <w:p>
+            <w:pPr>
+              <w:pStyle w:val="Compact"/>
+              <w:jc w:val="left"/>
+            </w:pPr>
+            <w:r>
+              <w:t xml:space="preserve">Reset toàn cục bất đồng bộ, tích cực mức thấp (được đồng bộ hóa giải trừ qua reset_sync)</w:t>
             </w:r>
           </w:p>
         </w:tc>
@@ -6347,7 +6347,7 @@
         <w:t xml:space="preserve">clk</w:t>
       </w:r>
       <w:r>
-        <w:t xml:space="preserve">) và đường reset đồng bộ</w:t>
+        <w:t xml:space="preserve">) và đường reset bất đồng bộ giải trừ đồng bộ</w:t>
       </w:r>
       <w:r>
         <w:t xml:space="preserve"> </w:t>
@@ -7082,7 +7082,7 @@
           <w:b/>
           <w:bCs/>
         </w:rPr>
-        <w:t xml:space="preserve">Bộ Đồng Bộ Hóa Reset Đồng Bộ Hoàn Toàn (</w:t>
+        <w:t xml:space="preserve">Bộ Đồng Bộ Hóa Reset Xác Lập Bất Đồng Bộ, Giải Trừ Đồng Bộ (</w:t>
       </w:r>
       <w:r>
         <w:rPr>
@@ -7151,7 +7151,7 @@
         </w:numPr>
       </w:pPr>
       <w:r>
-        <w:t xml:space="preserve">Sử dụng 2 tầng Flip-Flop đồng bộ hóa trên sườn dương</w:t>
+        <w:t xml:space="preserve">Sử dụng 2 tầng Flip-Flop: xác lập Reset bất đồng bộ tức thời khi</w:t>
       </w:r>
       <w:r>
         <w:t xml:space="preserve"> </w:t>
@@ -7160,22 +7160,22 @@
         <w:rPr>
           <w:rStyle w:val="VerbatimChar"/>
         </w:rPr>
-        <w:t xml:space="preserve">clk</w:t>
-      </w:r>
-      <w:r>
-        <w:t xml:space="preserve"> </w:t>
-      </w:r>
-      <w:r>
-        <w:t xml:space="preserve">(</w:t>
+        <w:t xml:space="preserve">rstn = 0</w:t>
+      </w:r>
+      <w:r>
+        <w:t xml:space="preserve"> </w:t>
+      </w:r>
+      <w:r>
+        <w:t xml:space="preserve">(zero clock latency) và giải trừ đồng bộ (</w:t>
       </w:r>
       <w:r>
         <w:rPr>
           <w:rStyle w:val="VerbatimChar"/>
         </w:rPr>
-        <w:t xml:space="preserve">always_ff @(posedge clk)</w:t>
-      </w:r>
-      <w:r>
-        <w:t xml:space="preserve">), tạo ra tín hiệu</w:t>
+        <w:t xml:space="preserve">Sync Deassert</w:t>
+      </w:r>
+      <w:r>
+        <w:t xml:space="preserve">) sau 2 chu kỳ clock 1 MHz khi</w:t>
       </w:r>
       <w:r>
         <w:t xml:space="preserve"> </w:t>
@@ -7184,13 +7184,10 @@
         <w:rPr>
           <w:rStyle w:val="VerbatimChar"/>
         </w:rPr>
-        <w:t xml:space="preserve">rstn_sync</w:t>
-      </w:r>
-      <w:r>
-        <w:t xml:space="preserve"> </w:t>
-      </w:r>
-      <w:r>
-        <w:t xml:space="preserve">kích hoạt đồng bộ.</w:t>
+        <w:t xml:space="preserve">rstn = 1</w:t>
+      </w:r>
+      <w:r>
+        <w:t xml:space="preserve">.</w:t>
       </w:r>
     </w:p>
     <w:p>
@@ -7202,16 +7199,31 @@
         </w:numPr>
       </w:pPr>
       <w:r>
-        <w:t xml:space="preserve">Các khối downstream sử dụng kiểu reset đồng bộ (</w:t>
+        <w:t xml:space="preserve">Các khối downstream sử dụng kiểu reset bất đồng bộ (</w:t>
       </w:r>
       <w:r>
         <w:rPr>
           <w:rStyle w:val="VerbatimChar"/>
         </w:rPr>
-        <w:t xml:space="preserve">if (!rstn)</w:t>
-      </w:r>
-      <w:r>
-        <w:t xml:space="preserve">), ánh xạ trực tiếp vào chân reset đồng bộ (S/R) của FPGA/ASIC cells, triệt tiêu hoàn toàn vi phạm thời gian Recovery và Removal.</w:t>
+        <w:t xml:space="preserve">always_ff @(posedge clk or negedge rstn)</w:t>
+      </w:r>
+      <w:r>
+        <w:t xml:space="preserve">), ánh xạ trực tiếp vào chân Clear/Reset bất đồng bộ của tế bào chuẩn ASIC/FPGA, kết hợp giải trừ đồng bộ qua</w:t>
+      </w:r>
+      <w:r>
+        <w:t xml:space="preserve"> </w:t>
+      </w:r>
+      <w:r>
+        <w:rPr>
+          <w:rStyle w:val="VerbatimChar"/>
+        </w:rPr>
+        <w:t xml:space="preserve">rstn_sync</w:t>
+      </w:r>
+      <w:r>
+        <w:t xml:space="preserve"> </w:t>
+      </w:r>
+      <w:r>
+        <w:t xml:space="preserve">giúp triệt tiêu hoàn toàn vi phạm thời gian Recovery và Removal.</w:t>
       </w:r>
     </w:p>
     <w:p>
@@ -7458,7 +7470,7 @@
               <w:jc w:val="left"/>
             </w:pPr>
             <w:r>
-              <w:t xml:space="preserve">Tín hiệu reset tích cực mức thấp được đồng bộ hóa khử vi phạm recovery/removal</w:t>
+              <w:t xml:space="preserve">Tín hiệu reset bất đồng bộ tích cực thấp được đồng bộ hóa giải trừ khử vi phạm recovery/removal</w:t>
             </w:r>
           </w:p>
         </w:tc>
@@ -8970,13 +8982,13 @@
         <w:t xml:space="preserve"> </w:t>
       </w:r>
       <w:r>
-        <w:t xml:space="preserve">Khối đồng bộ hóa reset hệ thống (Universal 2-Stage Synchronous Reset Synchronizer):</w:t>
-      </w:r>
-      <w:r>
-        <w:t xml:space="preserve"> </w:t>
-      </w:r>
-      <w:r>
-        <w:t xml:space="preserve">- Sử dụng kiến trúc đồng bộ hóa 2 tầng D Flip-Flop thuần túy trên sườn dương</w:t>
+        <w:t xml:space="preserve">Khối đồng bộ hóa reset hệ thống (Universal 2-Stage Asynchronous Assert, Synchronous Deassert Reset Synchronizer):</w:t>
+      </w:r>
+      <w:r>
+        <w:t xml:space="preserve"> </w:t>
+      </w:r>
+      <w:r>
+        <w:t xml:space="preserve">- Sử dụng kiến trúc đồng bộ hóa 2 tầng D Flip-Flop: xác lập Reset bất đồng bộ tức thời khi</w:t>
       </w:r>
       <w:r>
         <w:t xml:space="preserve"> </w:t>
@@ -8985,6 +8997,21 @@
         <w:rPr>
           <w:rStyle w:val="VerbatimChar"/>
         </w:rPr>
+        <w:t xml:space="preserve">rstn_async = 0</w:t>
+      </w:r>
+      <w:r>
+        <w:t xml:space="preserve"> </w:t>
+      </w:r>
+      <w:r>
+        <w:t xml:space="preserve">(zero clock latency) và giải trừ đồng bộ qua 2 chu kỳ xung nhịp</w:t>
+      </w:r>
+      <w:r>
+        <w:t xml:space="preserve"> </w:t>
+      </w:r>
+      <w:r>
+        <w:rPr>
+          <w:rStyle w:val="VerbatimChar"/>
+        </w:rPr>
         <w:t xml:space="preserve">clk</w:t>
       </w:r>
       <w:r>
@@ -8997,22 +9024,10 @@
         <w:rPr>
           <w:rStyle w:val="VerbatimChar"/>
         </w:rPr>
-        <w:t xml:space="preserve">always_ff @(posedge clk)</w:t>
-      </w:r>
-      <w:r>
-        <w:t xml:space="preserve">), tương thích hoàn hảo và phổ quát trên cả nền tảng FPGA (ánh xạ trực tiếp vào</w:t>
-      </w:r>
-      <w:r>
-        <w:t xml:space="preserve"> </w:t>
-      </w:r>
-      <w:r>
-        <w:rPr>
-          <w:rStyle w:val="VerbatimChar"/>
-        </w:rPr>
-        <w:t xml:space="preserve">FDRE</w:t>
-      </w:r>
-      <w:r>
-        <w:t xml:space="preserve">) và ASIC standard cell libraries.</w:t>
+        <w:t xml:space="preserve">always_ff @(posedge clk or negedge rstn_async)</w:t>
+      </w:r>
+      <w:r>
+        <w:t xml:space="preserve">), tương thích hoàn hảo và phổ quát trên cả nền tảng FPGA và ASIC standard cell libraries.</w:t>
       </w:r>
       <w:r>
         <w:t xml:space="preserve"> </w:t>
@@ -9522,19 +9537,19 @@
               <w:jc w:val="left"/>
             </w:pPr>
             <w:r>
-              <w:t xml:space="preserve">Tín hiệu reset tích cực mức thấp đã đồng bộ hóa giải trừ</w:t>
-            </w:r>
-          </w:p>
-        </w:tc>
-        <w:tc>
-          <w:tcPr/>
-          <w:p>
-            <w:pPr>
-              <w:pStyle w:val="Compact"/>
-              <w:jc w:val="left"/>
-            </w:pPr>
-            <w:r>
-              <w:t xml:space="preserve">Đồng bộ posedge clk</w:t>
+              <w:t xml:space="preserve">Tín hiệu reset tích cực mức thấp: xác lập bất đồng bộ tức thì, giải trừ đồng bộ</w:t>
+            </w:r>
+          </w:p>
+        </w:tc>
+        <w:tc>
+          <w:tcPr/>
+          <w:p>
+            <w:pPr>
+              <w:pStyle w:val="Compact"/>
+              <w:jc w:val="left"/>
+            </w:pPr>
+            <w:r>
+              <w:t xml:space="preserve">posedge clk / negedge rstn_async</w:t>
             </w:r>
           </w:p>
         </w:tc>
@@ -9564,7 +9579,7 @@
           <w:i/>
           <w:iCs/>
         </w:rPr>
-        <w:t xml:space="preserve">Ghi chú: Tín hiệu rstn_sync chuyển lên mức 1 sau 2 chu kỳ clk sau khi rstn_async giải trừ, triệt tiêu nguy cơ vi phạm timing.</w:t>
+        <w:t xml:space="preserve">Ghi chú: Tín hiệu rstn_sync xác lập mức 0 bất đồng bộ ngay khi rstn_async = 0 và chuyển lên mức 1 sau 2 chu kỳ clk sau khi rstn_async giải trừ, triệt tiêu nguy cơ vi phạm timing.</w:t>
       </w:r>
     </w:p>
     <w:bookmarkEnd w:id="46"/>
@@ -9590,7 +9605,7 @@
           <w:b/>
           <w:bCs/>
         </w:rPr>
-        <w:t xml:space="preserve">Kiến trúc Universal Synchronous 2-FF:</w:t>
+        <w:t xml:space="preserve">Kiến trúc Asynchronous Assert, Synchronous Deassert 2-FF:</w:t>
       </w:r>
       <w:r>
         <w:t xml:space="preserve"> </w:t>
@@ -9647,7 +9662,7 @@
         </w:numPr>
       </w:pPr>
       <w:r>
-        <w:t xml:space="preserve">Cả 2 tầng FF hoạt động đồng bộ trên sườn dương</w:t>
+        <w:t xml:space="preserve">Cả 2 tầng FF xác lập reset bất đồng bộ và dịch</w:t>
       </w:r>
       <w:r>
         <w:t xml:space="preserve"> </w:t>
@@ -9656,11 +9671,38 @@
         <w:rPr>
           <w:rStyle w:val="VerbatimChar"/>
         </w:rPr>
+        <w:t xml:space="preserve">1'b1</w:t>
+      </w:r>
+      <w:r>
+        <w:t xml:space="preserve"> </w:t>
+      </w:r>
+      <w:r>
+        <w:t xml:space="preserve">trên sườn dương</w:t>
+      </w:r>
+      <w:r>
+        <w:t xml:space="preserve"> </w:t>
+      </w:r>
+      <w:r>
+        <w:rPr>
+          <w:rStyle w:val="VerbatimChar"/>
+        </w:rPr>
         <w:t xml:space="preserve">clk</w:t>
       </w:r>
       <w:r>
         <w:t xml:space="preserve">:</w:t>
       </w:r>
+    </w:p>
+    <w:p>
+      <w:pPr>
+        <w:pStyle w:val="Compact"/>
+        <w:numPr>
+          <w:ilvl w:val="2"/>
+          <w:numId w:val="1021"/>
+        </w:numPr>
+      </w:pPr>
+      <w:r>
+        <w:t xml:space="preserve">Khi</w:t>
+      </w:r>
       <w:r>
         <w:t xml:space="preserve"> </w:t>
       </w:r>
@@ -9668,7 +9710,10 @@
         <w:rPr>
           <w:rStyle w:val="VerbatimChar"/>
         </w:rPr>
-        <w:t xml:space="preserve">r_sync_stage1 &lt;= rstn_async;</w:t>
+        <w:t xml:space="preserve">rstn_async == 0</w:t>
+      </w:r>
+      <w:r>
+        <w:t xml:space="preserve">:</w:t>
       </w:r>
       <w:r>
         <w:t xml:space="preserve"> </w:t>
@@ -9677,7 +9722,64 @@
         <w:rPr>
           <w:rStyle w:val="VerbatimChar"/>
         </w:rPr>
-        <w:t xml:space="preserve">r_sync_stage2 &lt;= r_sync_stage1;</w:t>
+        <w:t xml:space="preserve">r_sync_stage1 &lt;= 1'b0; r_sync_stage2 &lt;= 1'b0;</w:t>
+      </w:r>
+      <w:r>
+        <w:t xml:space="preserve"> </w:t>
+      </w:r>
+      <w:r>
+        <w:t xml:space="preserve">ngay lập tức (không phụ thuộc xung clock).</w:t>
+      </w:r>
+    </w:p>
+    <w:p>
+      <w:pPr>
+        <w:pStyle w:val="Compact"/>
+        <w:numPr>
+          <w:ilvl w:val="2"/>
+          <w:numId w:val="1021"/>
+        </w:numPr>
+      </w:pPr>
+      <w:r>
+        <w:t xml:space="preserve">Khi</w:t>
+      </w:r>
+      <w:r>
+        <w:t xml:space="preserve"> </w:t>
+      </w:r>
+      <w:r>
+        <w:rPr>
+          <w:rStyle w:val="VerbatimChar"/>
+        </w:rPr>
+        <w:t xml:space="preserve">rstn_async == 1</w:t>
+      </w:r>
+      <w:r>
+        <w:t xml:space="preserve">:</w:t>
+      </w:r>
+      <w:r>
+        <w:t xml:space="preserve"> </w:t>
+      </w:r>
+      <w:r>
+        <w:rPr>
+          <w:rStyle w:val="VerbatimChar"/>
+        </w:rPr>
+        <w:t xml:space="preserve">r_sync_stage1 &lt;= 1'b1; r_sync_stage2 &lt;= r_sync_stage1;</w:t>
+      </w:r>
+      <w:r>
+        <w:t xml:space="preserve"> </w:t>
+      </w:r>
+      <w:r>
+        <w:t xml:space="preserve">trên các cạnh</w:t>
+      </w:r>
+      <w:r>
+        <w:t xml:space="preserve"> </w:t>
+      </w:r>
+      <w:r>
+        <w:rPr>
+          <w:rStyle w:val="VerbatimChar"/>
+        </w:rPr>
+        <w:t xml:space="preserve">posedge clk</w:t>
+      </w:r>
+      <w:r>
+        <w:t xml:space="preserve">.</w:t>
       </w:r>
     </w:p>
     <w:p>
@@ -9735,7 +9837,7 @@
         <w:t xml:space="preserve"> </w:t>
       </w:r>
       <w:r>
-        <w:t xml:space="preserve">được đưa đến tất cả các khối chức năng con tuần tự trong hệ thống, đảm bảo toàn bộ hệ thống khởi động và thoát reset đồng thời và sạch sẽ.</w:t>
+        <w:t xml:space="preserve">được đưa đến chân reset bất đồng bộ của tất cả các khối chức năng con tuần tự trong hệ thống, đảm bảo toàn bộ hệ thống khởi động tức thời và thoát reset đồng thời, sạch sẽ sau 2 chu kỳ clock.</w:t>
       </w:r>
     </w:p>
     <w:bookmarkEnd w:id="47"/>
@@ -10271,19 +10373,22 @@
               <w:jc w:val="center"/>
             </w:pPr>
             <w:r>
-              <w:t xml:space="preserve">Sync</w:t>
-            </w:r>
-          </w:p>
-        </w:tc>
-        <w:tc>
-          <w:tcPr/>
-          <w:p>
-            <w:pPr>
-              <w:pStyle w:val="Compact"/>
-              <w:jc w:val="left"/>
-            </w:pPr>
-            <w:r>
-              <w:t xml:space="preserve">Reset đồng bộ, tích cực mức thấp (</w:t>
+              <w:t xml:space="preserve">Async (Sync Deassert)</w:t>
+            </w:r>
+          </w:p>
+        </w:tc>
+        <w:tc>
+          <w:tcPr/>
+          <w:p>
+            <w:pPr>
+              <w:pStyle w:val="Compact"/>
+              <w:jc w:val="left"/>
+            </w:pPr>
+            <w:r>
+              <w:t xml:space="preserve">Reset bất đồng bộ tích cực thấp (từ</w:t>
+            </w:r>
+            <w:r>
+              <w:t xml:space="preserve"> </w:t>
             </w:r>
             <w:r>
               <w:rPr>
@@ -10590,7 +10695,7 @@
         <w:pStyle w:val="Compact"/>
         <w:numPr>
           <w:ilvl w:val="0"/>
-          <w:numId w:val="1021"/>
+          <w:numId w:val="1022"/>
         </w:numPr>
       </w:pPr>
       <w:r>
@@ -10690,7 +10795,7 @@
         <w:pStyle w:val="Compact"/>
         <w:numPr>
           <w:ilvl w:val="0"/>
-          <w:numId w:val="1021"/>
+          <w:numId w:val="1022"/>
         </w:numPr>
       </w:pPr>
       <w:r>
@@ -10778,7 +10883,7 @@
         <w:pStyle w:val="Compact"/>
         <w:numPr>
           <w:ilvl w:val="0"/>
-          <w:numId w:val="1021"/>
+          <w:numId w:val="1022"/>
         </w:numPr>
       </w:pPr>
       <w:r>
@@ -10878,7 +10983,7 @@
         <w:pStyle w:val="Compact"/>
         <w:numPr>
           <w:ilvl w:val="0"/>
-          <w:numId w:val="1021"/>
+          <w:numId w:val="1022"/>
         </w:numPr>
       </w:pPr>
       <w:r>
@@ -11449,19 +11554,22 @@
               <w:jc w:val="center"/>
             </w:pPr>
             <w:r>
-              <w:t xml:space="preserve">Sync</w:t>
-            </w:r>
-          </w:p>
-        </w:tc>
-        <w:tc>
-          <w:tcPr/>
-          <w:p>
-            <w:pPr>
-              <w:pStyle w:val="Compact"/>
-              <w:jc w:val="left"/>
-            </w:pPr>
-            <w:r>
-              <w:t xml:space="preserve">Reset đồng bộ, tích cực mức thấp (</w:t>
+              <w:t xml:space="preserve">Async (Sync Deassert)</w:t>
+            </w:r>
+          </w:p>
+        </w:tc>
+        <w:tc>
+          <w:tcPr/>
+          <w:p>
+            <w:pPr>
+              <w:pStyle w:val="Compact"/>
+              <w:jc w:val="left"/>
+            </w:pPr>
+            <w:r>
+              <w:t xml:space="preserve">Reset bất đồng bộ tích cực thấp (từ</w:t>
+            </w:r>
+            <w:r>
+              <w:t xml:space="preserve"> </w:t>
             </w:r>
             <w:r>
               <w:rPr>
@@ -11866,7 +11974,7 @@
         <w:pStyle w:val="Compact"/>
         <w:numPr>
           <w:ilvl w:val="0"/>
-          <w:numId w:val="1022"/>
+          <w:numId w:val="1023"/>
         </w:numPr>
       </w:pPr>
       <w:r>
@@ -11948,7 +12056,7 @@
         <w:pStyle w:val="Compact"/>
         <w:numPr>
           <w:ilvl w:val="0"/>
-          <w:numId w:val="1022"/>
+          <w:numId w:val="1023"/>
         </w:numPr>
       </w:pPr>
       <w:r>
@@ -12000,7 +12108,7 @@
         <w:pStyle w:val="Compact"/>
         <w:numPr>
           <w:ilvl w:val="0"/>
-          <w:numId w:val="1022"/>
+          <w:numId w:val="1023"/>
         </w:numPr>
       </w:pPr>
       <w:r>
@@ -12031,7 +12139,7 @@
         <w:pStyle w:val="Compact"/>
         <w:numPr>
           <w:ilvl w:val="0"/>
-          <w:numId w:val="1022"/>
+          <w:numId w:val="1023"/>
         </w:numPr>
       </w:pPr>
       <w:r>
@@ -12053,7 +12161,7 @@
         <w:pStyle w:val="Compact"/>
         <w:numPr>
           <w:ilvl w:val="0"/>
-          <w:numId w:val="1022"/>
+          <w:numId w:val="1023"/>
         </w:numPr>
       </w:pPr>
       <w:r>
@@ -12651,19 +12759,22 @@
               <w:jc w:val="center"/>
             </w:pPr>
             <w:r>
-              <w:t xml:space="preserve">Sync</w:t>
-            </w:r>
-          </w:p>
-        </w:tc>
-        <w:tc>
-          <w:tcPr/>
-          <w:p>
-            <w:pPr>
-              <w:pStyle w:val="Compact"/>
-              <w:jc w:val="left"/>
-            </w:pPr>
-            <w:r>
-              <w:t xml:space="preserve">Reset đồng bộ, tích cực mức thấp (</w:t>
+              <w:t xml:space="preserve">Async (Sync Deassert)</w:t>
+            </w:r>
+          </w:p>
+        </w:tc>
+        <w:tc>
+          <w:tcPr/>
+          <w:p>
+            <w:pPr>
+              <w:pStyle w:val="Compact"/>
+              <w:jc w:val="left"/>
+            </w:pPr>
+            <w:r>
+              <w:t xml:space="preserve">Reset bất đồng bộ tích cực thấp (từ</w:t>
+            </w:r>
+            <w:r>
+              <w:t xml:space="preserve"> </w:t>
             </w:r>
             <w:r>
               <w:rPr>
@@ -13505,7 +13616,7 @@
         <w:pStyle w:val="Compact"/>
         <w:numPr>
           <w:ilvl w:val="0"/>
-          <w:numId w:val="1023"/>
+          <w:numId w:val="1024"/>
         </w:numPr>
       </w:pPr>
       <w:r>
@@ -13545,7 +13656,7 @@
         <w:pStyle w:val="Compact"/>
         <w:numPr>
           <w:ilvl w:val="0"/>
-          <w:numId w:val="1023"/>
+          <w:numId w:val="1024"/>
         </w:numPr>
       </w:pPr>
       <w:r>
@@ -13572,7 +13683,7 @@
         <w:pStyle w:val="Compact"/>
         <w:numPr>
           <w:ilvl w:val="0"/>
-          <w:numId w:val="1023"/>
+          <w:numId w:val="1024"/>
         </w:numPr>
       </w:pPr>
       <w:r>
@@ -14178,19 +14289,22 @@
               <w:jc w:val="center"/>
             </w:pPr>
             <w:r>
-              <w:t xml:space="preserve">Sync</w:t>
-            </w:r>
-          </w:p>
-        </w:tc>
-        <w:tc>
-          <w:tcPr/>
-          <w:p>
-            <w:pPr>
-              <w:pStyle w:val="Compact"/>
-              <w:jc w:val="left"/>
-            </w:pPr>
-            <w:r>
-              <w:t xml:space="preserve">Reset đồng bộ, tích cực mức thấp (</w:t>
+              <w:t xml:space="preserve">Async (Sync Deassert)</w:t>
+            </w:r>
+          </w:p>
+        </w:tc>
+        <w:tc>
+          <w:tcPr/>
+          <w:p>
+            <w:pPr>
+              <w:pStyle w:val="Compact"/>
+              <w:jc w:val="left"/>
+            </w:pPr>
+            <w:r>
+              <w:t xml:space="preserve">Reset bất đồng bộ tích cực thấp (từ</w:t>
+            </w:r>
+            <w:r>
+              <w:t xml:space="preserve"> </w:t>
             </w:r>
             <w:r>
               <w:rPr>
@@ -17712,19 +17826,22 @@
               <w:jc w:val="center"/>
             </w:pPr>
             <w:r>
-              <w:t xml:space="preserve">Sync</w:t>
-            </w:r>
-          </w:p>
-        </w:tc>
-        <w:tc>
-          <w:tcPr/>
-          <w:p>
-            <w:pPr>
-              <w:pStyle w:val="Compact"/>
-              <w:jc w:val="left"/>
-            </w:pPr>
-            <w:r>
-              <w:t xml:space="preserve">Reset đồng bộ, tích cực mức thấp (</w:t>
+              <w:t xml:space="preserve">Async (Sync Deassert)</w:t>
+            </w:r>
+          </w:p>
+        </w:tc>
+        <w:tc>
+          <w:tcPr/>
+          <w:p>
+            <w:pPr>
+              <w:pStyle w:val="Compact"/>
+              <w:jc w:val="left"/>
+            </w:pPr>
+            <w:r>
+              <w:t xml:space="preserve">Reset bất đồng bộ tích cực thấp (từ</w:t>
+            </w:r>
+            <w:r>
+              <w:t xml:space="preserve"> </w:t>
             </w:r>
             <w:r>
               <w:rPr>
@@ -18373,7 +18490,7 @@
         <w:pStyle w:val="Compact"/>
         <w:numPr>
           <w:ilvl w:val="0"/>
-          <w:numId w:val="1024"/>
+          <w:numId w:val="1025"/>
         </w:numPr>
       </w:pPr>
       <w:r>
@@ -18419,7 +18536,7 @@
         <w:pStyle w:val="Compact"/>
         <w:numPr>
           <w:ilvl w:val="0"/>
-          <w:numId w:val="1024"/>
+          <w:numId w:val="1025"/>
         </w:numPr>
       </w:pPr>
       <w:r>
@@ -18465,7 +18582,7 @@
         <w:pStyle w:val="Compact"/>
         <w:numPr>
           <w:ilvl w:val="0"/>
-          <w:numId w:val="1024"/>
+          <w:numId w:val="1025"/>
         </w:numPr>
       </w:pPr>
       <w:r>
@@ -19042,19 +19159,22 @@
               <w:jc w:val="center"/>
             </w:pPr>
             <w:r>
-              <w:t xml:space="preserve">Sync</w:t>
-            </w:r>
-          </w:p>
-        </w:tc>
-        <w:tc>
-          <w:tcPr/>
-          <w:p>
-            <w:pPr>
-              <w:pStyle w:val="Compact"/>
-              <w:jc w:val="left"/>
-            </w:pPr>
-            <w:r>
-              <w:t xml:space="preserve">Reset đồng bộ, tích cực mức thấp (</w:t>
+              <w:t xml:space="preserve">Async (Sync Deassert)</w:t>
+            </w:r>
+          </w:p>
+        </w:tc>
+        <w:tc>
+          <w:tcPr/>
+          <w:p>
+            <w:pPr>
+              <w:pStyle w:val="Compact"/>
+              <w:jc w:val="left"/>
+            </w:pPr>
+            <w:r>
+              <w:t xml:space="preserve">Reset bất đồng bộ tích cực thấp (từ</w:t>
+            </w:r>
+            <w:r>
+              <w:t xml:space="preserve"> </w:t>
             </w:r>
             <w:r>
               <w:rPr>
@@ -19703,7 +19823,7 @@
         <w:pStyle w:val="Compact"/>
         <w:numPr>
           <w:ilvl w:val="0"/>
-          <w:numId w:val="1025"/>
+          <w:numId w:val="1026"/>
         </w:numPr>
       </w:pPr>
       <w:r>
@@ -19749,7 +19869,7 @@
         <w:pStyle w:val="Compact"/>
         <w:numPr>
           <w:ilvl w:val="0"/>
-          <w:numId w:val="1025"/>
+          <w:numId w:val="1026"/>
         </w:numPr>
       </w:pPr>
       <w:r>
@@ -19795,7 +19915,7 @@
         <w:pStyle w:val="Compact"/>
         <w:numPr>
           <w:ilvl w:val="0"/>
-          <w:numId w:val="1025"/>
+          <w:numId w:val="1026"/>
         </w:numPr>
       </w:pPr>
       <w:r>
@@ -20384,19 +20504,22 @@
               <w:jc w:val="center"/>
             </w:pPr>
             <w:r>
-              <w:t xml:space="preserve">Sync</w:t>
-            </w:r>
-          </w:p>
-        </w:tc>
-        <w:tc>
-          <w:tcPr/>
-          <w:p>
-            <w:pPr>
-              <w:pStyle w:val="Compact"/>
-              <w:jc w:val="left"/>
-            </w:pPr>
-            <w:r>
-              <w:t xml:space="preserve">Reset đồng bộ, tích cực mức thấp (</w:t>
+              <w:t xml:space="preserve">Async (Sync Deassert)</w:t>
+            </w:r>
+          </w:p>
+        </w:tc>
+        <w:tc>
+          <w:tcPr/>
+          <w:p>
+            <w:pPr>
+              <w:pStyle w:val="Compact"/>
+              <w:jc w:val="left"/>
+            </w:pPr>
+            <w:r>
+              <w:t xml:space="preserve">Reset bất đồng bộ tích cực thấp (từ</w:t>
+            </w:r>
+            <w:r>
+              <w:t xml:space="preserve"> </w:t>
             </w:r>
             <w:r>
               <w:rPr>
@@ -20923,7 +21046,7 @@
         <w:pStyle w:val="Compact"/>
         <w:numPr>
           <w:ilvl w:val="0"/>
-          <w:numId w:val="1026"/>
+          <w:numId w:val="1027"/>
         </w:numPr>
       </w:pPr>
       <w:r>
@@ -20969,7 +21092,7 @@
         <w:pStyle w:val="Compact"/>
         <w:numPr>
           <w:ilvl w:val="0"/>
-          <w:numId w:val="1026"/>
+          <w:numId w:val="1027"/>
         </w:numPr>
       </w:pPr>
       <w:r>
@@ -22564,7 +22687,7 @@
         <w:pStyle w:val="Compact"/>
         <w:numPr>
           <w:ilvl w:val="0"/>
-          <w:numId w:val="1027"/>
+          <w:numId w:val="1028"/>
         </w:numPr>
       </w:pPr>
       <w:r>
@@ -22591,7 +22714,7 @@
         <w:pStyle w:val="Compact"/>
         <w:numPr>
           <w:ilvl w:val="1"/>
-          <w:numId w:val="1028"/>
+          <w:numId w:val="1029"/>
         </w:numPr>
       </w:pPr>
       <w:r>
@@ -22606,7 +22729,7 @@
         <w:pStyle w:val="Compact"/>
         <w:numPr>
           <w:ilvl w:val="1"/>
-          <w:numId w:val="1028"/>
+          <w:numId w:val="1029"/>
         </w:numPr>
       </w:pPr>
       <w:r>
@@ -22621,7 +22744,7 @@
         <w:pStyle w:val="Compact"/>
         <w:numPr>
           <w:ilvl w:val="1"/>
-          <w:numId w:val="1028"/>
+          <w:numId w:val="1029"/>
         </w:numPr>
       </w:pPr>
       <w:r>
@@ -24834,7 +24957,7 @@
         <w:pStyle w:val="Compact"/>
         <w:numPr>
           <w:ilvl w:val="0"/>
-          <w:numId w:val="1029"/>
+          <w:numId w:val="1030"/>
         </w:numPr>
       </w:pPr>
       <w:r>
@@ -24880,7 +25003,7 @@
         <w:pStyle w:val="Compact"/>
         <w:numPr>
           <w:ilvl w:val="0"/>
-          <w:numId w:val="1029"/>
+          <w:numId w:val="1030"/>
         </w:numPr>
       </w:pPr>
       <w:r>
@@ -24932,7 +25055,7 @@
         <w:pStyle w:val="Compact"/>
         <w:numPr>
           <w:ilvl w:val="0"/>
-          <w:numId w:val="1029"/>
+          <w:numId w:val="1030"/>
         </w:numPr>
       </w:pPr>
       <w:r>
@@ -25026,7 +25149,7 @@
         <w:pStyle w:val="Compact"/>
         <w:numPr>
           <w:ilvl w:val="0"/>
-          <w:numId w:val="1029"/>
+          <w:numId w:val="1030"/>
         </w:numPr>
       </w:pPr>
       <w:r>
@@ -25048,7 +25171,7 @@
         <w:pStyle w:val="Compact"/>
         <w:numPr>
           <w:ilvl w:val="0"/>
-          <w:numId w:val="1029"/>
+          <w:numId w:val="1030"/>
         </w:numPr>
       </w:pPr>
       <w:r>
@@ -25070,7 +25193,7 @@
         <w:pStyle w:val="Compact"/>
         <w:numPr>
           <w:ilvl w:val="0"/>
-          <w:numId w:val="1029"/>
+          <w:numId w:val="1030"/>
         </w:numPr>
       </w:pPr>
       <w:r>
@@ -25092,7 +25215,7 @@
         <w:pStyle w:val="Compact"/>
         <w:numPr>
           <w:ilvl w:val="0"/>
-          <w:numId w:val="1029"/>
+          <w:numId w:val="1030"/>
         </w:numPr>
       </w:pPr>
       <w:r>
@@ -25114,7 +25237,7 @@
         <w:pStyle w:val="Compact"/>
         <w:numPr>
           <w:ilvl w:val="0"/>
-          <w:numId w:val="1029"/>
+          <w:numId w:val="1030"/>
         </w:numPr>
       </w:pPr>
       <w:r>
@@ -25136,7 +25259,7 @@
         <w:pStyle w:val="Compact"/>
         <w:numPr>
           <w:ilvl w:val="0"/>
-          <w:numId w:val="1029"/>
+          <w:numId w:val="1030"/>
         </w:numPr>
       </w:pPr>
       <w:r>
@@ -25158,7 +25281,7 @@
         <w:pStyle w:val="Compact"/>
         <w:numPr>
           <w:ilvl w:val="0"/>
-          <w:numId w:val="1029"/>
+          <w:numId w:val="1030"/>
         </w:numPr>
       </w:pPr>
       <w:r>
@@ -25180,7 +25303,7 @@
         <w:pStyle w:val="Compact"/>
         <w:numPr>
           <w:ilvl w:val="0"/>
-          <w:numId w:val="1029"/>
+          <w:numId w:val="1030"/>
         </w:numPr>
       </w:pPr>
       <w:r>
@@ -25202,7 +25325,7 @@
         <w:pStyle w:val="Compact"/>
         <w:numPr>
           <w:ilvl w:val="0"/>
-          <w:numId w:val="1029"/>
+          <w:numId w:val="1030"/>
         </w:numPr>
       </w:pPr>
       <w:r>
@@ -25224,7 +25347,7 @@
         <w:pStyle w:val="Compact"/>
         <w:numPr>
           <w:ilvl w:val="0"/>
-          <w:numId w:val="1029"/>
+          <w:numId w:val="1030"/>
         </w:numPr>
       </w:pPr>
       <w:r>
@@ -25246,7 +25369,7 @@
         <w:pStyle w:val="Compact"/>
         <w:numPr>
           <w:ilvl w:val="0"/>
-          <w:numId w:val="1029"/>
+          <w:numId w:val="1030"/>
         </w:numPr>
       </w:pPr>
       <w:r>
@@ -26258,34 +26381,7 @@
     <w:abstractNumId w:val="991"/>
   </w:num>
   <w:num w:numId="1024">
-    <w:abstractNumId w:val="99411"/>
-    <w:lvlOverride w:ilvl="0">
-      <w:startOverride w:val="1"/>
-    </w:lvlOverride>
-    <w:lvlOverride w:ilvl="1">
-      <w:startOverride w:val="1"/>
-    </w:lvlOverride>
-    <w:lvlOverride w:ilvl="2">
-      <w:startOverride w:val="1"/>
-    </w:lvlOverride>
-    <w:lvlOverride w:ilvl="3">
-      <w:startOverride w:val="1"/>
-    </w:lvlOverride>
-    <w:lvlOverride w:ilvl="4">
-      <w:startOverride w:val="1"/>
-    </w:lvlOverride>
-    <w:lvlOverride w:ilvl="5">
-      <w:startOverride w:val="1"/>
-    </w:lvlOverride>
-    <w:lvlOverride w:ilvl="6">
-      <w:startOverride w:val="1"/>
-    </w:lvlOverride>
-    <w:lvlOverride w:ilvl="7">
-      <w:startOverride w:val="1"/>
-    </w:lvlOverride>
-    <w:lvlOverride w:ilvl="8">
-      <w:startOverride w:val="1"/>
-    </w:lvlOverride>
+    <w:abstractNumId w:val="991"/>
   </w:num>
   <w:num w:numId="1025">
     <w:abstractNumId w:val="99411"/>
@@ -26348,12 +26444,42 @@
     </w:lvlOverride>
   </w:num>
   <w:num w:numId="1027">
-    <w:abstractNumId w:val="991"/>
+    <w:abstractNumId w:val="99411"/>
+    <w:lvlOverride w:ilvl="0">
+      <w:startOverride w:val="1"/>
+    </w:lvlOverride>
+    <w:lvlOverride w:ilvl="1">
+      <w:startOverride w:val="1"/>
+    </w:lvlOverride>
+    <w:lvlOverride w:ilvl="2">
+      <w:startOverride w:val="1"/>
+    </w:lvlOverride>
+    <w:lvlOverride w:ilvl="3">
+      <w:startOverride w:val="1"/>
+    </w:lvlOverride>
+    <w:lvlOverride w:ilvl="4">
+      <w:startOverride w:val="1"/>
+    </w:lvlOverride>
+    <w:lvlOverride w:ilvl="5">
+      <w:startOverride w:val="1"/>
+    </w:lvlOverride>
+    <w:lvlOverride w:ilvl="6">
+      <w:startOverride w:val="1"/>
+    </w:lvlOverride>
+    <w:lvlOverride w:ilvl="7">
+      <w:startOverride w:val="1"/>
+    </w:lvlOverride>
+    <w:lvlOverride w:ilvl="8">
+      <w:startOverride w:val="1"/>
+    </w:lvlOverride>
   </w:num>
   <w:num w:numId="1028">
     <w:abstractNumId w:val="991"/>
   </w:num>
   <w:num w:numId="1029">
+    <w:abstractNumId w:val="991"/>
+  </w:num>
+  <w:num w:numId="1030">
     <w:abstractNumId w:val="99411"/>
     <w:lvlOverride w:ilvl="0">
       <w:startOverride w:val="1"/>

</xml_diff>